<commit_message>
test: committable real-adapter emulator E2E harness (29 checks) + updated fix report v2
</commit_message>
<xml_diff>
--- a/docs/NextGen-Fund-Fix-Report-v2.docx
+++ b/docs/NextGen-Fund-Fix-Report-v2.docx
@@ -831,7 +831,383 @@
         <w:rPr>
           <w:rFonts w:ascii="Nirmala UI" w:hAnsi="Nirmala UI"/>
         </w:rPr>
-        <w:t>5. Deploy + evidence</w:t>
+        <w:t>5. Real-adapter E2E (Firestore + Auth emulator, real rules)</w:t>
+      </w:r>
+    </w:p>
+    <w:p>
+      <w:r>
+        <w:rPr>
+          <w:b w:val="0"/>
+        </w:rPr>
+        <w:t>Production code (assets/js/firebase-adapter.js) emulator-e chaliye 29 ta check - shudhu 4 ta SDK import line local shim e redirect, app logic ek line o poriborton hoy ni.</w:t>
+      </w:r>
+    </w:p>
+    <w:tbl>
+      <w:tblPr>
+        <w:tblStyle w:val="LightGrid-Accent1"/>
+        <w:tblW w:type="auto" w:w="0"/>
+        <w:tblLook w:firstColumn="1" w:firstRow="1" w:lastColumn="0" w:lastRow="0" w:noHBand="0" w:noVBand="1" w:val="04A0"/>
+      </w:tblPr>
+      <w:tblGrid>
+        <w:gridCol w:w="4320"/>
+        <w:gridCol w:w="4320"/>
+      </w:tblGrid>
+      <w:tr>
+        <w:tc>
+          <w:tcPr>
+            <w:tcW w:type="dxa" w:w="4320"/>
+          </w:tcPr>
+          <w:p>
+            <w:r/>
+            <w:r>
+              <w:rPr>
+                <w:b/>
+              </w:rPr>
+              <w:t>Area</w:t>
+            </w:r>
+          </w:p>
+        </w:tc>
+        <w:tc>
+          <w:tcPr>
+            <w:tcW w:type="dxa" w:w="4320"/>
+          </w:tcPr>
+          <w:p>
+            <w:r/>
+            <w:r>
+              <w:rPr>
+                <w:b/>
+              </w:rPr>
+              <w:t>Result</w:t>
+            </w:r>
+          </w:p>
+        </w:tc>
+      </w:tr>
+      <w:tr>
+        <w:tc>
+          <w:tcPr>
+            <w:tcW w:type="dxa" w:w="4320"/>
+          </w:tcPr>
+          <w:p>
+            <w:r>
+              <w:t>First admin fund claim kore</w:t>
+            </w:r>
+          </w:p>
+        </w:tc>
+        <w:tc>
+          <w:tcPr>
+            <w:tcW w:type="dxa" w:w="4320"/>
+          </w:tcPr>
+          <w:p>
+            <w:r>
+              <w:t>PASS</w:t>
+            </w:r>
+          </w:p>
+        </w:tc>
+      </w:tr>
+      <w:tr>
+        <w:tc>
+          <w:tcPr>
+            <w:tcW w:type="dxa" w:w="4320"/>
+          </w:tcPr>
+          <w:p>
+            <w:r>
+              <w:t>Member register -&gt; admin approve</w:t>
+            </w:r>
+          </w:p>
+        </w:tc>
+        <w:tc>
+          <w:tcPr>
+            <w:tcW w:type="dxa" w:w="4320"/>
+          </w:tcPr>
+          <w:p>
+            <w:r>
+              <w:t>PASS</w:t>
+            </w:r>
+          </w:p>
+        </w:tc>
+      </w:tr>
+      <w:tr>
+        <w:tc>
+          <w:tcPr>
+            <w:tcW w:type="dxa" w:w="4320"/>
+          </w:tcPr>
+          <w:p>
+            <w:r>
+              <w:t>Due = 1 mash x 1000 = 1000</w:t>
+            </w:r>
+          </w:p>
+        </w:tc>
+        <w:tc>
+          <w:tcPr>
+            <w:tcW w:type="dxa" w:w="4320"/>
+          </w:tcPr>
+          <w:p>
+            <w:r>
+              <w:t>PASS</w:t>
+            </w:r>
+          </w:p>
+        </w:tc>
+      </w:tr>
+      <w:tr>
+        <w:tc>
+          <w:tcPr>
+            <w:tcW w:type="dxa" w:w="4320"/>
+          </w:tcPr>
+          <w:p>
+            <w:r>
+              <w:t>Pending payment submit -&gt; due sathe sathe 0</w:t>
+            </w:r>
+          </w:p>
+        </w:tc>
+        <w:tc>
+          <w:tcPr>
+            <w:tcW w:type="dxa" w:w="4320"/>
+          </w:tcPr>
+          <w:p>
+            <w:r>
+              <w:t>PASS</w:t>
+            </w:r>
+          </w:p>
+        </w:tc>
+      </w:tr>
+      <w:tr>
+        <w:tc>
+          <w:tcPr>
+            <w:tcW w:type="dxa" w:w="4320"/>
+          </w:tcPr>
+          <w:p>
+            <w:r>
+              <w:t>pendingDue UI note er jonno alada dekhay</w:t>
+            </w:r>
+          </w:p>
+        </w:tc>
+        <w:tc>
+          <w:tcPr>
+            <w:tcW w:type="dxa" w:w="4320"/>
+          </w:tcPr>
+          <w:p>
+            <w:r>
+              <w:t>PASS</w:t>
+            </w:r>
+          </w:p>
+        </w:tc>
+      </w:tr>
+      <w:tr>
+        <w:tc>
+          <w:tcPr>
+            <w:tcW w:type="dxa" w:w="4320"/>
+          </w:tcPr>
+          <w:p>
+            <w:r>
+              <w:t>Pending fund income hishebe gonona hoy na</w:t>
+            </w:r>
+          </w:p>
+        </w:tc>
+        <w:tc>
+          <w:tcPr>
+            <w:tcW w:type="dxa" w:w="4320"/>
+          </w:tcPr>
+          <w:p>
+            <w:r>
+              <w:t>PASS</w:t>
+            </w:r>
+          </w:p>
+        </w:tc>
+      </w:tr>
+      <w:tr>
+        <w:tc>
+          <w:tcPr>
+            <w:tcW w:type="dxa" w:w="4320"/>
+          </w:tcPr>
+          <w:p>
+            <w:r>
+              <w:t>Admin approve -&gt; totalFunding 1000 + memberDeposits 1000 + pendingDue 0 (auto)</w:t>
+            </w:r>
+          </w:p>
+        </w:tc>
+        <w:tc>
+          <w:tcPr>
+            <w:tcW w:type="dxa" w:w="4320"/>
+          </w:tcPr>
+          <w:p>
+            <w:r>
+              <w:t>PASS</w:t>
+            </w:r>
+          </w:p>
+        </w:tc>
+      </w:tr>
+      <w:tr>
+        <w:tc>
+          <w:tcPr>
+            <w:tcW w:type="dxa" w:w="4320"/>
+          </w:tcPr>
+          <w:p>
+            <w:r>
+              <w:t>Sept month row e funding 1000</w:t>
+            </w:r>
+          </w:p>
+        </w:tc>
+        <w:tc>
+          <w:tcPr>
+            <w:tcW w:type="dxa" w:w="4320"/>
+          </w:tcPr>
+          <w:p>
+            <w:r>
+              <w:t>PASS</w:t>
+            </w:r>
+          </w:p>
+        </w:tc>
+      </w:tr>
+      <w:tr>
+        <w:tc>
+          <w:tcPr>
+            <w:tcW w:type="dxa" w:w="4320"/>
+          </w:tcPr>
+          <w:p>
+            <w:r>
+              <w:t>Member ar admin view eksomoy mil (paid 1000 / due 0)</w:t>
+            </w:r>
+          </w:p>
+        </w:tc>
+        <w:tc>
+          <w:tcPr>
+            <w:tcW w:type="dxa" w:w="4320"/>
+          </w:tcPr>
+          <w:p>
+            <w:r>
+              <w:t>PASS</w:t>
+            </w:r>
+          </w:p>
+        </w:tc>
+      </w:tr>
+      <w:tr>
+        <w:tc>
+          <w:tcPr>
+            <w:tcW w:type="dxa" w:w="4320"/>
+          </w:tcPr>
+          <w:p>
+            <w:r>
+              <w:t>Admin nijer nam poriborton -&gt; persist</w:t>
+            </w:r>
+          </w:p>
+        </w:tc>
+        <w:tc>
+          <w:tcPr>
+            <w:tcW w:type="dxa" w:w="4320"/>
+          </w:tcPr>
+          <w:p>
+            <w:r>
+              <w:t>PASS</w:t>
+            </w:r>
+          </w:p>
+        </w:tc>
+      </w:tr>
+      <w:tr>
+        <w:tc>
+          <w:tcPr>
+            <w:tcW w:type="dxa" w:w="4320"/>
+          </w:tcPr>
+          <w:p>
+            <w:r>
+              <w:t>Admin password change: bhul current -&gt; friendly error; notun diye login; purono reject</w:t>
+            </w:r>
+          </w:p>
+        </w:tc>
+        <w:tc>
+          <w:tcPr>
+            <w:tcW w:type="dxa" w:w="4320"/>
+          </w:tcPr>
+          <w:p>
+            <w:r>
+              <w:t>PASS</w:t>
+            </w:r>
+          </w:p>
+        </w:tc>
+      </w:tr>
+      <w:tr>
+        <w:tc>
+          <w:tcPr>
+            <w:tcW w:type="dxa" w:w="4320"/>
+          </w:tcPr>
+          <w:p>
+            <w:r>
+              <w:t>Edge: 0 / negative / 1500 / duplicate reference - shob reject, balance thik</w:t>
+            </w:r>
+          </w:p>
+        </w:tc>
+        <w:tc>
+          <w:tcPr>
+            <w:tcW w:type="dxa" w:w="4320"/>
+          </w:tcPr>
+          <w:p>
+            <w:r>
+              <w:t>PASS</w:t>
+            </w:r>
+          </w:p>
+        </w:tc>
+      </w:tr>
+      <w:tr>
+        <w:tc>
+          <w:tcPr>
+            <w:tcW w:type="dxa" w:w="4320"/>
+          </w:tcPr>
+          <w:p>
+            <w:r>
+              <w:t>Member kono payment verify/settings/finance/approve korte pare na (rules)</w:t>
+            </w:r>
+          </w:p>
+        </w:tc>
+        <w:tc>
+          <w:tcPr>
+            <w:tcW w:type="dxa" w:w="4320"/>
+          </w:tcPr>
+          <w:p>
+            <w:r>
+              <w:t>PASS</w:t>
+            </w:r>
+          </w:p>
+        </w:tc>
+      </w:tr>
+      <w:tr>
+        <w:tc>
+          <w:tcPr>
+            <w:tcW w:type="dxa" w:w="4320"/>
+          </w:tcPr>
+          <w:p>
+            <w:r>
+              <w:t>Ei test e ekta REAL BUG dhora porlo: password change korar por audit line e crash (undefined ref) - fix kora hoyeche</w:t>
+            </w:r>
+          </w:p>
+        </w:tc>
+        <w:tc>
+          <w:tcPr>
+            <w:tcW w:type="dxa" w:w="4320"/>
+          </w:tcPr>
+          <w:p>
+            <w:r>
+              <w:t>FIXED</w:t>
+            </w:r>
+          </w:p>
+        </w:tc>
+      </w:tr>
+    </w:tbl>
+    <w:p>
+      <w:r>
+        <w:rPr>
+          <w:b w:val="0"/>
+        </w:rPr>
+        <w:t>Chalate: tests/e2e-emulator/README.md dekhen (build-harness.mjs + reset_emulators.mjs + fixes-live-e2e.mjs).</w:t>
+      </w:r>
+    </w:p>
+    <w:p>
+      <w:pPr>
+        <w:pStyle w:val="Heading1"/>
+      </w:pPr>
+      <w:r>
+        <w:rPr>
+          <w:rFonts w:ascii="Nirmala UI" w:hAnsi="Nirmala UI"/>
+        </w:rPr>
+        <w:t>6. Deploy + evidence</w:t>
       </w:r>
     </w:p>
     <w:tbl>
@@ -881,7 +1257,7 @@
           </w:tcPr>
           <w:p>
             <w:r>
-              <w:t>GitHub commit</w:t>
+              <w:t>GitHub commits</w:t>
             </w:r>
           </w:p>
         </w:tc>
@@ -891,7 +1267,7 @@
           </w:tcPr>
           <w:p>
             <w:r>
-              <w:t>5e1ac5b (main)</w:t>
+              <w:t>5e1ac5b, a350f46, 65acdfd (main)</w:t>
             </w:r>
           </w:p>
         </w:tc>
@@ -957,7 +1333,7 @@
           </w:tcPr>
           <w:p>
             <w:r>
-              <w:t>107 assertions pass (59 store + 12 access + 14 isolation + 22 new fixes)</w:t>
+              <w:t>136 assertions pass (59 store + 12 access + 14 isolation + 22 fixes + 29 real-adapter E2E)</w:t>
             </w:r>
           </w:p>
         </w:tc>
@@ -993,7 +1369,7 @@
         <w:rPr>
           <w:rFonts w:ascii="Nirmala UI" w:hAnsi="Nirmala UI"/>
         </w:rPr>
-        <w:t>6. Apnar 2 ta chhoto click (baki thaklo)</w:t>
+        <w:t>7. Apnar 2 ta chhoto click (baki thaklo)</w:t>
       </w:r>
     </w:p>
     <w:p>
@@ -1026,7 +1402,7 @@
         <w:rPr>
           <w:rFonts w:ascii="Nirmala UI" w:hAnsi="Nirmala UI"/>
         </w:rPr>
-        <w:t>7. Backup &amp; rollback plan</w:t>
+        <w:t>8. Backup &amp; rollback plan</w:t>
       </w:r>
     </w:p>
     <w:p>
@@ -1092,7 +1468,7 @@
         <w:rPr>
           <w:rFonts w:ascii="Nirmala UI" w:hAnsi="Nirmala UI"/>
         </w:rPr>
-        <w:t>8. Notes</w:t>
+        <w:t>9. Notes</w:t>
       </w:r>
     </w:p>
     <w:p>

</xml_diff>

<commit_message>
docs: fix report v2 - live production fund-totals proof (5000 = member deposits, auto)
</commit_message>
<xml_diff>
--- a/docs/NextGen-Fund-Fix-Report-v2.docx
+++ b/docs/NextGen-Fund-Fix-Report-v2.docx
@@ -623,7 +623,7 @@
           </w:tcPr>
           <w:p>
             <w:r>
-              <w:t>Fund totals sync code: verify/reject/record/finance/settings action hole auto chole</w:t>
+              <w:t>LIVE PRODUCTION: fundTotals auto-write hoyeche (totalFunding 5000 = memberDeposits 5000, manual entry chara)</w:t>
             </w:r>
           </w:p>
         </w:tc>
@@ -633,7 +633,7 @@
           </w:tcPr>
           <w:p>
             <w:r>
-              <w:t>Code deployed; apnar 1 ta admin click er por live value dekhe debo</w:t>
+              <w:t>PASS - live Firestore e verified</w:t>
             </w:r>
           </w:p>
         </w:tc>
@@ -1369,7 +1369,7 @@
         <w:rPr>
           <w:rFonts w:ascii="Nirmala UI" w:hAnsi="Nirmala UI"/>
         </w:rPr>
-        <w:t>7. Apnar 2 ta chhoto click (baki thaklo)</w:t>
+        <w:t>7. Apnar jonno ekhon baki tha ka kaj (optional)</w:t>
       </w:r>
     </w:p>
     <w:p>
@@ -1380,7 +1380,7 @@
         <w:rPr>
           <w:rFonts w:ascii="Nirmala UI" w:hAnsi="Nirmala UI"/>
         </w:rPr>
-        <w:t>Admin -&gt; Payments: ekta pending payment Verify korun (ba Settings e Save korun) - tahole fund totals live e populate hobe, ami verify kore debo.</w:t>
+        <w:t>Fund totals live e populate hoye geche (totalFunding 5000) - ei kaj ta ses.</w:t>
       </w:r>
     </w:p>
     <w:p>

</xml_diff>